<commit_message>
presentation rough draft, close to final draft of report
</commit_message>
<xml_diff>
--- a/Project 1/Dissemination/Project 1 Final Report.docx
+++ b/Project 1/Dissemination/Project 1 Final Report.docx
@@ -154,7 +154,7 @@
         <w:t>1 Introduction</w:t>
       </w:r>
     </w:p>
-    <w:p xmlns:wp14="http://schemas.microsoft.com/office/word/2010/wordml" wp14:paraId="380D6498" wp14:textId="715704CA">
+    <w:p xmlns:wp14="http://schemas.microsoft.com/office/word/2010/wordml" wp14:paraId="380D6498" wp14:textId="63F6CFDD">
       <w:pPr>
         <w:pStyle w:val="Normal"/>
         <w:spacing w:before="0" w:beforeAutospacing="off" w:after="0" w:afterAutospacing="off" w:line="480" w:lineRule="auto"/>
@@ -224,7 +224,7 @@
           <w:szCs w:val="24"/>
           <w:lang w:val="en-US"/>
         </w:rPr>
-        <w:t xml:space="preserve"> Multicenter AIDS Cohort Study which aimed to study HIV-1 in homosexual and bisexual men from 4 locations in the United States. </w:t>
+        <w:t xml:space="preserve"> Multicenter AIDS Cohort Study which aimed to study HIV-1 in homosexual and bisexual men from </w:t>
       </w:r>
       <w:r>
         <w:rPr>
@@ -241,7 +241,7 @@
           <w:szCs w:val="24"/>
           <w:lang w:val="en-US"/>
         </w:rPr>
-        <w:t>715 i</w:t>
+        <w:t>four</w:t>
       </w:r>
       <w:r>
         <w:rPr>
@@ -258,7 +258,47 @@
           <w:szCs w:val="24"/>
           <w:lang w:val="en-US"/>
         </w:rPr>
-        <w:t>ndividuals</w:t>
+        <w:t xml:space="preserve"> locations in the United States. </w:t>
+      </w:r>
+      <w:r>
+        <w:rPr>
+          <w:rFonts w:ascii="Times New Roman" w:hAnsi="Times New Roman" w:eastAsia="Times New Roman" w:cs="Times New Roman"/>
+          <w:noProof w:val="0"/>
+          <w:sz w:val="24"/>
+          <w:szCs w:val="24"/>
+          <w:lang w:val="en-US"/>
+        </w:rPr>
+        <w:t>A total</w:t>
+      </w:r>
+      <w:r>
+        <w:rPr>
+          <w:rFonts w:ascii="Times New Roman" w:hAnsi="Times New Roman" w:eastAsia="Times New Roman" w:cs="Times New Roman"/>
+          <w:noProof w:val="0"/>
+          <w:sz w:val="24"/>
+          <w:szCs w:val="24"/>
+          <w:lang w:val="en-US"/>
+        </w:rPr>
+        <w:t xml:space="preserve"> of 715 individuals in this study were seen annually and have approximately eight years of follow-up data. Year 0 </w:t>
+      </w:r>
+      <w:r>
+        <w:rPr>
+          <w:rFonts w:ascii="Times New Roman" w:hAnsi="Times New Roman" w:eastAsia="Times New Roman" w:cs="Times New Roman"/>
+          <w:noProof w:val="0"/>
+          <w:sz w:val="24"/>
+          <w:szCs w:val="24"/>
+          <w:lang w:val="en-US"/>
+        </w:rPr>
+        <w:t>represents</w:t>
+      </w:r>
+      <w:r>
+        <w:rPr>
+          <w:rFonts w:ascii="Times New Roman" w:hAnsi="Times New Roman" w:eastAsia="Times New Roman" w:cs="Times New Roman"/>
+          <w:noProof w:val="0"/>
+          <w:sz w:val="24"/>
+          <w:szCs w:val="24"/>
+          <w:lang w:val="en-US"/>
+        </w:rPr>
+        <w:t xml:space="preserve"> an individual’s last untreated visit, defined as the visit before initiation of highly active antiretroviral treatment (HAART).</w:t>
       </w:r>
       <w:r>
         <w:rPr>
@@ -275,7 +315,7 @@
           <w:szCs w:val="24"/>
           <w:lang w:val="en-US"/>
         </w:rPr>
-        <w:t xml:space="preserve"> in this study were seen annually and have approximately 8 years of follow up data and year 0 </w:t>
+        <w:t xml:space="preserve"> Primar</w:t>
       </w:r>
       <w:r>
         <w:rPr>
@@ -292,7 +332,7 @@
           <w:szCs w:val="24"/>
           <w:lang w:val="en-US"/>
         </w:rPr>
-        <w:t>represents</w:t>
+        <w:t>y outcomes include</w:t>
       </w:r>
       <w:r>
         <w:rPr>
@@ -309,7 +349,7 @@
           <w:szCs w:val="24"/>
           <w:lang w:val="en-US"/>
         </w:rPr>
-        <w:t xml:space="preserve"> an individual’s last untreated visit which is the visit before they began highly active antiretrovi</w:t>
+        <w:t>d</w:t>
       </w:r>
       <w:r>
         <w:rPr>
@@ -326,7 +366,7 @@
           <w:szCs w:val="24"/>
           <w:lang w:val="en-US"/>
         </w:rPr>
-        <w:t>ral treatment (HAART)</w:t>
+        <w:t xml:space="preserve"> quality</w:t>
       </w:r>
       <w:r>
         <w:rPr>
@@ -343,7 +383,7 @@
           <w:szCs w:val="24"/>
           <w:lang w:val="en-US"/>
         </w:rPr>
-        <w:t>. Primar</w:t>
+        <w:t>-</w:t>
       </w:r>
       <w:r>
         <w:rPr>
@@ -360,7 +400,7 @@
           <w:szCs w:val="24"/>
           <w:lang w:val="en-US"/>
         </w:rPr>
-        <w:t>y outcomes include quality of life measure</w:t>
+        <w:t>of life</w:t>
       </w:r>
       <w:r>
         <w:rPr>
@@ -377,7 +417,7 @@
           <w:szCs w:val="24"/>
           <w:lang w:val="en-US"/>
         </w:rPr>
-        <w:t>s and l</w:t>
+        <w:t xml:space="preserve"> </w:t>
       </w:r>
       <w:r>
         <w:rPr>
@@ -394,7 +434,58 @@
           <w:szCs w:val="24"/>
           <w:lang w:val="en-US"/>
         </w:rPr>
-        <w:t>aboratory values.</w:t>
+        <w:t>measure</w:t>
+      </w:r>
+      <w:r>
+        <w:rPr>
+          <w:rFonts w:ascii="Times New Roman" w:hAnsi="Times New Roman" w:eastAsia="Times New Roman" w:cs="Times New Roman"/>
+          <w:b w:val="0"/>
+          <w:bCs w:val="0"/>
+          <w:i w:val="0"/>
+          <w:iCs w:val="0"/>
+          <w:caps w:val="0"/>
+          <w:smallCaps w:val="0"/>
+          <w:noProof w:val="0"/>
+          <w:color w:val="auto"/>
+          <w:sz w:val="24"/>
+          <w:szCs w:val="24"/>
+          <w:lang w:val="en-US"/>
+        </w:rPr>
+        <w:t xml:space="preserve">s and </w:t>
+      </w:r>
+      <w:r>
+        <w:rPr>
+          <w:rFonts w:ascii="Times New Roman" w:hAnsi="Times New Roman" w:eastAsia="Times New Roman" w:cs="Times New Roman"/>
+          <w:b w:val="0"/>
+          <w:bCs w:val="0"/>
+          <w:i w:val="0"/>
+          <w:iCs w:val="0"/>
+          <w:caps w:val="0"/>
+          <w:smallCaps w:val="0"/>
+          <w:noProof w:val="0"/>
+          <w:color w:val="auto"/>
+          <w:sz w:val="24"/>
+          <w:szCs w:val="24"/>
+          <w:lang w:val="en-US"/>
+        </w:rPr>
+        <w:t xml:space="preserve">immunologic and virologic marker </w:t>
+      </w:r>
+      <w:r>
+        <w:rPr>
+          <w:rFonts w:ascii="Times New Roman" w:hAnsi="Times New Roman" w:eastAsia="Times New Roman" w:cs="Times New Roman"/>
+          <w:b w:val="0"/>
+          <w:bCs w:val="0"/>
+          <w:i w:val="0"/>
+          <w:iCs w:val="0"/>
+          <w:caps w:val="0"/>
+          <w:smallCaps w:val="0"/>
+          <w:noProof w:val="0"/>
+          <w:color w:val="auto"/>
+          <w:sz w:val="24"/>
+          <w:szCs w:val="24"/>
+          <w:lang w:val="en-US"/>
+        </w:rPr>
+        <w:t>values.</w:t>
       </w:r>
     </w:p>
     <w:p>
@@ -403,13 +494,6 @@
         <w:spacing w:before="0" w:beforeAutospacing="off" w:after="0" w:afterAutospacing="off" w:line="480" w:lineRule="auto"/>
         <w:ind w:firstLine="720"/>
         <w:jc w:val="left"/>
-        <w:rPr>
-          <w:rFonts w:ascii="Times New Roman" w:hAnsi="Times New Roman" w:eastAsia="Times New Roman" w:cs="Times New Roman"/>
-          <w:noProof w:val="0"/>
-          <w:sz w:val="24"/>
-          <w:szCs w:val="24"/>
-          <w:lang w:val="en-US"/>
-        </w:rPr>
       </w:pPr>
       <w:r>
         <w:rPr>
@@ -419,7 +503,7 @@
           <w:szCs w:val="24"/>
           <w:lang w:val="en-US"/>
         </w:rPr>
-        <w:t>This report addresses five research questions. First, it was hypothesized that baseline hard-drug users would experience a higher viral load from baseline to year 2 compared with non-users, with a 0.5 log</w:t>
+        <w:t>This report addresses five research questions focused on whether baseline hard-drug use is associated with differences in clinical and quality-of-life outcomes over two years of follow-up. First, it was hypothesized that there would be a decrease in viral load from baseline to year 2, and that this decrease would differ between drug users and non-users, with a 0.5 log</w:t>
       </w:r>
       <w:r>
         <w:rPr>
@@ -440,7 +524,7 @@
           <w:szCs w:val="24"/>
           <w:lang w:val="en-US"/>
         </w:rPr>
-        <w:t xml:space="preserve"> clinically meaningful difference. Second, baseline hard-drug users were expected to experience a greater decline in CD4+ T cell counts over the same period, with a meaningful difference of 50 cells. Third and fourth, baseline hard-drug users were hypothesized to experience greater declines in physical and mental quality-of-life scores compared with non-users, with a clinically meaningful difference of 2 points. Finally, the report examined whether differences in these outcomes by baseline drug use could be explained by adherence </w:t>
+        <w:t xml:space="preserve"> copies/ml denoting a clinically meaningful decrease. Second, it was expected that there would be an increase in CD4+ T cell counts over the same period, with a clinically meaningful increase of 50 cells, and that this increase would differ between drug users and non-users. Third and fourth, it was hypothesized that there would be improvements in physical and mental quality-of-life scores, and that these improvements would differ between drug users and non-users, with a clinically meaningful increase of 2 points. Finally, the report examined whether differences in these outcomes by baseline drug use could be explained by adherence </w:t>
       </w:r>
       <w:r>
         <w:rPr>
@@ -543,7 +627,6 @@
       <w:pPr>
         <w:pStyle w:val="Normal"/>
         <w:suppressLineNumbers w:val="0"/>
-        <w:bidi w:val="0"/>
         <w:spacing w:before="0" w:beforeAutospacing="off" w:after="0" w:afterAutospacing="off" w:line="480" w:lineRule="auto"/>
         <w:ind w:left="0" w:right="0" w:firstLine="720"/>
         <w:jc w:val="left"/>
@@ -563,27 +646,127 @@
           <w:szCs w:val="24"/>
           <w:lang w:val="en-US"/>
         </w:rPr>
-        <w:t xml:space="preserve">The original dataset included 715 individuals and 3,935 observations. After restricting the data to participants with all four outcomes at baseline and year </w:t>
-      </w:r>
-      <w:r>
-        <w:rPr>
-          <w:rFonts w:ascii="Times New Roman" w:hAnsi="Times New Roman" w:eastAsia="Times New Roman" w:cs="Times New Roman"/>
-          <w:noProof w:val="0"/>
-          <w:sz w:val="24"/>
-          <w:szCs w:val="24"/>
-          <w:lang w:val="en-US"/>
-        </w:rPr>
-        <w:t>2 and</w:t>
-      </w:r>
-      <w:r>
-        <w:rPr>
-          <w:rFonts w:ascii="Times New Roman" w:hAnsi="Times New Roman" w:eastAsia="Times New Roman" w:cs="Times New Roman"/>
-          <w:noProof w:val="0"/>
-          <w:sz w:val="24"/>
-          <w:szCs w:val="24"/>
-          <w:lang w:val="en-US"/>
-        </w:rPr>
-        <w:t xml:space="preserve"> excluding BMI values below 0 or above </w:t>
+        <w:t>The original dataset included 715 individuals and 3,935 observations. After restricting the data to participants with all four outcomes at baseline</w:t>
+      </w:r>
+      <w:r>
+        <w:rPr>
+          <w:rFonts w:ascii="Times New Roman" w:hAnsi="Times New Roman" w:eastAsia="Times New Roman" w:cs="Times New Roman"/>
+          <w:noProof w:val="0"/>
+          <w:sz w:val="24"/>
+          <w:szCs w:val="24"/>
+          <w:lang w:val="en-US"/>
+        </w:rPr>
+        <w:t xml:space="preserve"> </w:t>
+      </w:r>
+      <w:r>
+        <w:rPr>
+          <w:rFonts w:ascii="Times New Roman" w:hAnsi="Times New Roman" w:eastAsia="Times New Roman" w:cs="Times New Roman"/>
+          <w:noProof w:val="0"/>
+          <w:sz w:val="24"/>
+          <w:szCs w:val="24"/>
+          <w:lang w:val="en-US"/>
+        </w:rPr>
+        <w:t xml:space="preserve">and year </w:t>
+      </w:r>
+      <w:r>
+        <w:rPr>
+          <w:rFonts w:ascii="Times New Roman" w:hAnsi="Times New Roman" w:eastAsia="Times New Roman" w:cs="Times New Roman"/>
+          <w:noProof w:val="0"/>
+          <w:sz w:val="24"/>
+          <w:szCs w:val="24"/>
+          <w:lang w:val="en-US"/>
+        </w:rPr>
+        <w:t>2</w:t>
+      </w:r>
+      <w:r>
+        <w:rPr>
+          <w:rFonts w:ascii="Times New Roman" w:hAnsi="Times New Roman" w:eastAsia="Times New Roman" w:cs="Times New Roman"/>
+          <w:noProof w:val="0"/>
+          <w:sz w:val="24"/>
+          <w:szCs w:val="24"/>
+          <w:lang w:val="en-US"/>
+        </w:rPr>
+        <w:t>, per the investigator’s request,</w:t>
+      </w:r>
+      <w:r>
+        <w:rPr>
+          <w:rFonts w:ascii="Times New Roman" w:hAnsi="Times New Roman" w:eastAsia="Times New Roman" w:cs="Times New Roman"/>
+          <w:noProof w:val="0"/>
+          <w:sz w:val="24"/>
+          <w:szCs w:val="24"/>
+          <w:lang w:val="en-US"/>
+        </w:rPr>
+        <w:t xml:space="preserve"> and</w:t>
+      </w:r>
+      <w:r>
+        <w:rPr>
+          <w:rFonts w:ascii="Times New Roman" w:hAnsi="Times New Roman" w:eastAsia="Times New Roman" w:cs="Times New Roman"/>
+          <w:noProof w:val="0"/>
+          <w:sz w:val="24"/>
+          <w:szCs w:val="24"/>
+          <w:lang w:val="en-US"/>
+        </w:rPr>
+        <w:t xml:space="preserve"> excluding </w:t>
+      </w:r>
+      <w:r>
+        <w:rPr>
+          <w:rFonts w:ascii="Times New Roman" w:hAnsi="Times New Roman" w:eastAsia="Times New Roman" w:cs="Times New Roman"/>
+          <w:noProof w:val="0"/>
+          <w:sz w:val="24"/>
+          <w:szCs w:val="24"/>
+          <w:lang w:val="en-US"/>
+        </w:rPr>
+        <w:t xml:space="preserve">implausible </w:t>
+      </w:r>
+      <w:r>
+        <w:rPr>
+          <w:rFonts w:ascii="Times New Roman" w:hAnsi="Times New Roman" w:eastAsia="Times New Roman" w:cs="Times New Roman"/>
+          <w:noProof w:val="0"/>
+          <w:sz w:val="24"/>
+          <w:szCs w:val="24"/>
+          <w:lang w:val="en-US"/>
+        </w:rPr>
+        <w:t xml:space="preserve">BMI values </w:t>
+      </w:r>
+      <w:r>
+        <w:rPr>
+          <w:rFonts w:ascii="Times New Roman" w:hAnsi="Times New Roman" w:eastAsia="Times New Roman" w:cs="Times New Roman"/>
+          <w:noProof w:val="0"/>
+          <w:sz w:val="24"/>
+          <w:szCs w:val="24"/>
+          <w:lang w:val="en-US"/>
+        </w:rPr>
+        <w:t>(</w:t>
+      </w:r>
+      <w:r>
+        <w:rPr>
+          <w:rFonts w:ascii="Times New Roman" w:hAnsi="Times New Roman" w:eastAsia="Times New Roman" w:cs="Times New Roman"/>
+          <w:noProof w:val="0"/>
+          <w:sz w:val="24"/>
+          <w:szCs w:val="24"/>
+          <w:lang w:val="en-US"/>
+        </w:rPr>
+        <w:t>&lt;</w:t>
+      </w:r>
+      <w:r>
+        <w:rPr>
+          <w:rFonts w:ascii="Times New Roman" w:hAnsi="Times New Roman" w:eastAsia="Times New Roman" w:cs="Times New Roman"/>
+          <w:noProof w:val="0"/>
+          <w:sz w:val="24"/>
+          <w:szCs w:val="24"/>
+          <w:lang w:val="en-US"/>
+        </w:rPr>
+        <w:t xml:space="preserve">0 or </w:t>
+      </w:r>
+      <w:r>
+        <w:rPr>
+          <w:rFonts w:ascii="Times New Roman" w:hAnsi="Times New Roman" w:eastAsia="Times New Roman" w:cs="Times New Roman"/>
+          <w:noProof w:val="0"/>
+          <w:sz w:val="24"/>
+          <w:szCs w:val="24"/>
+          <w:lang w:val="en-US"/>
+        </w:rPr>
+        <w:t>&gt;</w:t>
       </w:r>
       <w:r>
         <w:rPr>
@@ -624,7 +807,17 @@
           <w:szCs w:val="24"/>
           <w:lang w:val="en-US"/>
         </w:rPr>
-        <w:t xml:space="preserve">, 463 individuals </w:t>
+        <w:t>),</w:t>
+      </w:r>
+      <w:r>
+        <w:rPr>
+          <w:rFonts w:ascii="Times New Roman" w:hAnsi="Times New Roman" w:eastAsia="Times New Roman" w:cs="Times New Roman"/>
+          <w:noProof w:val="0"/>
+          <w:sz w:val="24"/>
+          <w:szCs w:val="24"/>
+          <w:lang w:val="en-US"/>
+        </w:rPr>
+        <w:t xml:space="preserve"> 463 individuals </w:t>
       </w:r>
       <w:r>
         <w:rPr>
@@ -644,7 +837,37 @@
           <w:szCs w:val="24"/>
           <w:lang w:val="en-US"/>
         </w:rPr>
-        <w:t>. Due to small sample sizes, categorical covariates were grouped: education (no college vs. college or higher), smoking (current vs. not), race (white, non-Hispanic vs. other), and year 2 adherence (&lt;95% vs. ≥95%).</w:t>
+        <w:t xml:space="preserve">. </w:t>
+      </w:r>
+      <w:r>
+        <w:rPr>
+          <w:rFonts w:ascii="Times New Roman" w:hAnsi="Times New Roman" w:eastAsia="Times New Roman" w:cs="Times New Roman"/>
+          <w:noProof w:val="0"/>
+          <w:sz w:val="24"/>
+          <w:szCs w:val="24"/>
+          <w:lang w:val="en-US"/>
+        </w:rPr>
+        <w:t xml:space="preserve">Since viral load and CD4+ T cell counts do not have an upper limit and all quality-of-life scores were between 0 and 100, no other observations were excluded. </w:t>
+      </w:r>
+      <w:r>
+        <w:rPr>
+          <w:rFonts w:ascii="Times New Roman" w:hAnsi="Times New Roman" w:eastAsia="Times New Roman" w:cs="Times New Roman"/>
+          <w:noProof w:val="0"/>
+          <w:sz w:val="24"/>
+          <w:szCs w:val="24"/>
+          <w:lang w:val="en-US"/>
+        </w:rPr>
+        <w:t>Due to small sample sizes, categorical covariates were grouped: education (no college vs. college or higher), smoking (current vs. not), race (white, non-Hispanic vs. other), and year 2 adherence (&lt;95% vs. ≥95%).</w:t>
+      </w:r>
+      <w:r>
+        <w:rPr>
+          <w:rFonts w:ascii="Times New Roman" w:hAnsi="Times New Roman" w:eastAsia="Times New Roman" w:cs="Times New Roman"/>
+          <w:noProof w:val="0"/>
+          <w:sz w:val="24"/>
+          <w:szCs w:val="24"/>
+          <w:lang w:val="en-US"/>
+        </w:rPr>
+        <w:t xml:space="preserve"> </w:t>
       </w:r>
     </w:p>
     <w:p xmlns:wp14="http://schemas.microsoft.com/office/word/2010/wordml" wp14:paraId="44BA94CF" wp14:textId="39384DF7">
@@ -706,7 +929,37 @@
           <w:szCs w:val="24"/>
           <w:lang w:val="en-US"/>
         </w:rPr>
-        <w:t>To address the researcher’s first four questions, separate multivariable linear regression models were fit for each outcome at year 2, with baseline drug use as the primary explanatory variable. Models were adjusted for year 2 adherence and baseline covariates: age, BMI, race, education, smoking status, and the baseline outcome value.</w:t>
+        <w:t>To address the researcher’s first four questions, separate multivariable linear regression models were fit for each outcome at year 2, with baseline drug use as the primary explanatory variable. Models were adjusted for year 2 adherence and baseline covariates</w:t>
+      </w:r>
+      <w:r>
+        <w:rPr>
+          <w:rFonts w:ascii="Times New Roman" w:hAnsi="Times New Roman" w:eastAsia="Times New Roman" w:cs="Times New Roman"/>
+          <w:noProof w:val="0"/>
+          <w:sz w:val="24"/>
+          <w:szCs w:val="24"/>
+          <w:lang w:val="en-US"/>
+        </w:rPr>
+        <w:t xml:space="preserve"> such as</w:t>
+      </w:r>
+      <w:r>
+        <w:rPr>
+          <w:rFonts w:ascii="Times New Roman" w:hAnsi="Times New Roman" w:eastAsia="Times New Roman" w:cs="Times New Roman"/>
+          <w:noProof w:val="0"/>
+          <w:sz w:val="24"/>
+          <w:szCs w:val="24"/>
+          <w:lang w:val="en-US"/>
+        </w:rPr>
+        <w:t xml:space="preserve"> age, BMI, race, education, smoking status, and the baseline outcome value.</w:t>
+      </w:r>
+      <w:r>
+        <w:rPr>
+          <w:rFonts w:ascii="Times New Roman" w:hAnsi="Times New Roman" w:eastAsia="Times New Roman" w:cs="Times New Roman"/>
+          <w:noProof w:val="0"/>
+          <w:sz w:val="24"/>
+          <w:szCs w:val="24"/>
+          <w:lang w:val="en-US"/>
+        </w:rPr>
+        <w:t xml:space="preserve"> </w:t>
       </w:r>
     </w:p>
     <w:p>
@@ -730,7 +983,79 @@
           <w:szCs w:val="24"/>
           <w:lang w:val="en-US"/>
         </w:rPr>
-        <w:t>A standard frequentist linear regression was first fit, followed by a Bayesian model for greater flexibility and direct interpretation of clinically meaningful probabilities. Both used complete case analysis, and assumptions of linearity, homoscedasticity, and normality of residuals were evaluated with diagnostic plots. Analyses were conducted in R version 4.4.1.</w:t>
+        <w:t xml:space="preserve">A standard frequentist linear regression was first fit, followed by a Bayesian model for greater flexibility and </w:t>
+      </w:r>
+      <w:r>
+        <w:rPr>
+          <w:rFonts w:ascii="Times New Roman" w:hAnsi="Times New Roman" w:eastAsia="Times New Roman" w:cs="Times New Roman"/>
+          <w:noProof w:val="0"/>
+          <w:sz w:val="24"/>
+          <w:szCs w:val="24"/>
+          <w:lang w:val="en-US"/>
+        </w:rPr>
+        <w:t xml:space="preserve">direct interpretation of clinically meaningful probabilities. Both used complete case analysis, and assumptions of linearity, homoscedasticity, and normality of residuals were evaluated with diagnostic plots. </w:t>
+      </w:r>
+      <w:r>
+        <w:rPr>
+          <w:rFonts w:ascii="Times New Roman" w:hAnsi="Times New Roman" w:eastAsia="Times New Roman" w:cs="Times New Roman"/>
+          <w:b w:val="0"/>
+          <w:bCs w:val="0"/>
+          <w:i w:val="0"/>
+          <w:iCs w:val="0"/>
+          <w:noProof w:val="0"/>
+          <w:sz w:val="24"/>
+          <w:szCs w:val="24"/>
+          <w:lang w:val="en-US"/>
+        </w:rPr>
+        <w:t xml:space="preserve">Linear regression was </w:t>
+      </w:r>
+      <w:r>
+        <w:rPr>
+          <w:rFonts w:ascii="Times New Roman" w:hAnsi="Times New Roman" w:eastAsia="Times New Roman" w:cs="Times New Roman"/>
+          <w:b w:val="0"/>
+          <w:bCs w:val="0"/>
+          <w:i w:val="0"/>
+          <w:iCs w:val="0"/>
+          <w:noProof w:val="0"/>
+          <w:sz w:val="24"/>
+          <w:szCs w:val="24"/>
+          <w:lang w:val="en-US"/>
+        </w:rPr>
+        <w:t>appropriate because</w:t>
+      </w:r>
+      <w:r>
+        <w:rPr>
+          <w:rFonts w:ascii="Times New Roman" w:hAnsi="Times New Roman" w:eastAsia="Times New Roman" w:cs="Times New Roman"/>
+          <w:b w:val="0"/>
+          <w:bCs w:val="0"/>
+          <w:i w:val="0"/>
+          <w:iCs w:val="0"/>
+          <w:noProof w:val="0"/>
+          <w:sz w:val="24"/>
+          <w:szCs w:val="24"/>
+          <w:lang w:val="en-US"/>
+        </w:rPr>
+        <w:t xml:space="preserve"> all outcomes were continuous, allowing us to estimate adjusted mean differences. Bayesian models were also suitable because they provide stable estimates with small subgroup sizes and allow direct calculation of probabilities for clinically meaningful effects.</w:t>
+      </w:r>
+      <w:r>
+        <w:rPr>
+          <w:rFonts w:ascii="Times New Roman" w:hAnsi="Times New Roman" w:eastAsia="Times New Roman" w:cs="Times New Roman"/>
+          <w:noProof w:val="0"/>
+          <w:sz w:val="24"/>
+          <w:szCs w:val="24"/>
+          <w:lang w:val="en-US"/>
+        </w:rPr>
+        <w:t xml:space="preserve"> </w:t>
+      </w:r>
+      <w:r>
+        <w:rPr>
+          <w:rFonts w:ascii="Times New Roman" w:hAnsi="Times New Roman" w:eastAsia="Times New Roman" w:cs="Times New Roman"/>
+          <w:noProof w:val="0"/>
+          <w:sz w:val="24"/>
+          <w:szCs w:val="24"/>
+          <w:lang w:val="en-US"/>
+        </w:rPr>
+        <w:t>Analyses were conducted in R version 4.4.1.</w:t>
       </w:r>
     </w:p>
     <w:p>
@@ -755,7 +1080,17 @@
           <w:szCs w:val="24"/>
           <w:lang w:val="en-US"/>
         </w:rPr>
-        <w:t xml:space="preserve">Bayesian models used weakly informative priors (Intercept ~ </w:t>
+        <w:t>All B</w:t>
+      </w:r>
+      <w:r>
+        <w:rPr>
+          <w:rFonts w:ascii="Times New Roman" w:hAnsi="Times New Roman" w:eastAsia="Times New Roman" w:cs="Times New Roman"/>
+          <w:noProof w:val="0"/>
+          <w:sz w:val="24"/>
+          <w:szCs w:val="24"/>
+          <w:lang w:val="en-US"/>
+        </w:rPr>
+        <w:t xml:space="preserve">ayesian models used weakly informative priors (Intercept ~ </w:t>
       </w:r>
       <w:r>
         <w:rPr>
@@ -815,7 +1150,29 @@
           <w:szCs w:val="24"/>
           <w:lang w:val="en-US"/>
         </w:rPr>
-        <w:t>0,10,000)) and were fit using brms with No-U-Turn</w:t>
+        <w:t xml:space="preserve">0,10,000)) and were fit using </w:t>
+      </w:r>
+      <w:r>
+        <w:rPr>
+          <w:rFonts w:ascii="Times New Roman" w:hAnsi="Times New Roman" w:eastAsia="Times New Roman" w:cs="Times New Roman"/>
+          <w:i w:val="1"/>
+          <w:iCs w:val="1"/>
+          <w:noProof w:val="0"/>
+          <w:sz w:val="24"/>
+          <w:szCs w:val="24"/>
+          <w:lang w:val="en-US"/>
+        </w:rPr>
+        <w:t xml:space="preserve">brms </w:t>
+      </w:r>
+      <w:r>
+        <w:rPr>
+          <w:rFonts w:ascii="Times New Roman" w:hAnsi="Times New Roman" w:eastAsia="Times New Roman" w:cs="Times New Roman"/>
+          <w:noProof w:val="0"/>
+          <w:sz w:val="24"/>
+          <w:szCs w:val="24"/>
+          <w:lang w:val="en-US"/>
+        </w:rPr>
+        <w:t>with No-U-Turn</w:t>
       </w:r>
       <w:r>
         <w:rPr>
@@ -875,7 +1232,102 @@
           <w:szCs w:val="24"/>
           <w:lang w:val="en-US"/>
         </w:rPr>
-        <w:t xml:space="preserve">, 25,000 iterations). Trace plots assessed convergence. Frequentist results report estimates, 95% CIs, and p-values; Bayesian results report estimates, 95% </w:t>
+        <w:t xml:space="preserve">, 25,000 iterations). Trace plots assessed </w:t>
+      </w:r>
+      <w:r>
+        <w:rPr>
+          <w:rFonts w:ascii="Times New Roman" w:hAnsi="Times New Roman" w:eastAsia="Times New Roman" w:cs="Times New Roman"/>
+          <w:noProof w:val="0"/>
+          <w:sz w:val="24"/>
+          <w:szCs w:val="24"/>
+          <w:lang w:val="en-US"/>
+        </w:rPr>
+        <w:t xml:space="preserve">model </w:t>
+      </w:r>
+      <w:r>
+        <w:rPr>
+          <w:rFonts w:ascii="Times New Roman" w:hAnsi="Times New Roman" w:eastAsia="Times New Roman" w:cs="Times New Roman"/>
+          <w:noProof w:val="0"/>
+          <w:sz w:val="24"/>
+          <w:szCs w:val="24"/>
+          <w:lang w:val="en-US"/>
+        </w:rPr>
+        <w:t>convergence</w:t>
+      </w:r>
+      <w:r>
+        <w:rPr>
+          <w:rFonts w:ascii="Times New Roman" w:hAnsi="Times New Roman" w:eastAsia="Times New Roman" w:cs="Times New Roman"/>
+          <w:noProof w:val="0"/>
+          <w:sz w:val="24"/>
+          <w:szCs w:val="24"/>
+          <w:lang w:val="en-US"/>
+        </w:rPr>
+        <w:t xml:space="preserve">. </w:t>
+      </w:r>
+    </w:p>
+    <w:p>
+      <w:pPr>
+        <w:pStyle w:val="Normal"/>
+        <w:spacing w:before="0" w:beforeAutospacing="off" w:after="0" w:afterAutospacing="off" w:line="480" w:lineRule="auto"/>
+        <w:ind w:firstLine="720"/>
+        <w:jc w:val="left"/>
+        <w:rPr>
+          <w:rFonts w:ascii="Times New Roman" w:hAnsi="Times New Roman" w:eastAsia="Times New Roman" w:cs="Times New Roman"/>
+          <w:noProof w:val="0"/>
+          <w:sz w:val="24"/>
+          <w:szCs w:val="24"/>
+          <w:lang w:val="en-US"/>
+        </w:rPr>
+      </w:pPr>
+      <w:r>
+        <w:rPr>
+          <w:rFonts w:ascii="Times New Roman" w:hAnsi="Times New Roman" w:eastAsia="Times New Roman" w:cs="Times New Roman"/>
+          <w:noProof w:val="0"/>
+          <w:sz w:val="24"/>
+          <w:szCs w:val="24"/>
+          <w:lang w:val="en-US"/>
+        </w:rPr>
+        <w:t xml:space="preserve">For both modeling frameworks, since differences in baseline drug usage were of </w:t>
+      </w:r>
+      <w:r>
+        <w:rPr>
+          <w:rFonts w:ascii="Times New Roman" w:hAnsi="Times New Roman" w:eastAsia="Times New Roman" w:cs="Times New Roman"/>
+          <w:noProof w:val="0"/>
+          <w:sz w:val="24"/>
+          <w:szCs w:val="24"/>
+          <w:lang w:val="en-US"/>
+        </w:rPr>
+        <w:t>interest,</w:t>
+      </w:r>
+      <w:r>
+        <w:rPr>
+          <w:rFonts w:ascii="Times New Roman" w:hAnsi="Times New Roman" w:eastAsia="Times New Roman" w:cs="Times New Roman"/>
+          <w:noProof w:val="0"/>
+          <w:sz w:val="24"/>
+          <w:szCs w:val="24"/>
+          <w:lang w:val="en-US"/>
+        </w:rPr>
+        <w:t xml:space="preserve"> inference will only be made on its coefficient. </w:t>
+      </w:r>
+      <w:r>
+        <w:rPr>
+          <w:rFonts w:ascii="Times New Roman" w:hAnsi="Times New Roman" w:eastAsia="Times New Roman" w:cs="Times New Roman"/>
+          <w:noProof w:val="0"/>
+          <w:sz w:val="24"/>
+          <w:szCs w:val="24"/>
+          <w:lang w:val="en-US"/>
+        </w:rPr>
+        <w:t>F</w:t>
+      </w:r>
+      <w:r>
+        <w:rPr>
+          <w:rFonts w:ascii="Times New Roman" w:hAnsi="Times New Roman" w:eastAsia="Times New Roman" w:cs="Times New Roman"/>
+          <w:noProof w:val="0"/>
+          <w:sz w:val="24"/>
+          <w:szCs w:val="24"/>
+          <w:lang w:val="en-US"/>
+        </w:rPr>
+        <w:t xml:space="preserve">requentist results report estimates, 95% CIs, and p-values; Bayesian results report estimates, 95% </w:t>
       </w:r>
       <w:r>
         <w:rPr>
@@ -989,7 +1441,27 @@
           <w:szCs w:val="24"/>
           <w:lang w:val="en-US"/>
         </w:rPr>
-        <w:t xml:space="preserve"> Bayesian models excluded adherence to evaluate its role. Overlapping </w:t>
+        <w:t xml:space="preserve"> Bayesian models excluded adherence to evaluate its role</w:t>
+      </w:r>
+      <w:r>
+        <w:rPr>
+          <w:rFonts w:ascii="Times New Roman" w:hAnsi="Times New Roman" w:eastAsia="Times New Roman" w:cs="Times New Roman"/>
+          <w:noProof w:val="0"/>
+          <w:sz w:val="24"/>
+          <w:szCs w:val="24"/>
+          <w:lang w:val="en-US"/>
+        </w:rPr>
+        <w:t xml:space="preserve"> on each outcome</w:t>
+      </w:r>
+      <w:r>
+        <w:rPr>
+          <w:rFonts w:ascii="Times New Roman" w:hAnsi="Times New Roman" w:eastAsia="Times New Roman" w:cs="Times New Roman"/>
+          <w:noProof w:val="0"/>
+          <w:sz w:val="24"/>
+          <w:szCs w:val="24"/>
+          <w:lang w:val="en-US"/>
+        </w:rPr>
+        <w:t xml:space="preserve">. Overlapping </w:t>
       </w:r>
       <w:r>
         <w:rPr>
@@ -1041,26 +1513,6 @@
         </w:rPr>
         <w:t xml:space="preserve"> no evidence that baseline hard drug use affected year 2 adherence.</w:t>
       </w:r>
-    </w:p>
-    <w:p>
-      <w:pPr>
-        <w:spacing w:before="0" w:beforeAutospacing="off" w:after="0" w:afterAutospacing="off" w:line="480" w:lineRule="auto"/>
-        <w:jc w:val="left"/>
-        <w:rPr>
-          <w:rFonts w:ascii="Times New Roman" w:hAnsi="Times New Roman" w:eastAsia="Times New Roman" w:cs="Times New Roman"/>
-          <w:b w:val="1"/>
-          <w:bCs w:val="1"/>
-          <w:i w:val="0"/>
-          <w:iCs w:val="0"/>
-          <w:caps w:val="0"/>
-          <w:smallCaps w:val="0"/>
-          <w:noProof w:val="0"/>
-          <w:color w:val="auto"/>
-          <w:sz w:val="24"/>
-          <w:szCs w:val="24"/>
-          <w:lang w:val="en-US"/>
-        </w:rPr>
-      </w:pPr>
     </w:p>
     <w:p>
       <w:pPr>
@@ -4842,47 +5294,37 @@
           <w:szCs w:val="24"/>
           <w:lang w:val="en-US"/>
         </w:rPr>
-        <w:t>of</w:t>
-      </w:r>
-      <w:r>
-        <w:rPr>
-          <w:rFonts w:ascii="Times New Roman" w:hAnsi="Times New Roman" w:eastAsia="Times New Roman" w:cs="Times New Roman"/>
-          <w:noProof w:val="0"/>
-          <w:sz w:val="24"/>
-          <w:szCs w:val="24"/>
-          <w:lang w:val="en-US"/>
-        </w:rPr>
-        <w:t xml:space="preserve"> </w:t>
-      </w:r>
-      <w:r>
-        <w:rPr>
-          <w:rFonts w:ascii="Times New Roman" w:hAnsi="Times New Roman" w:eastAsia="Times New Roman" w:cs="Times New Roman"/>
-          <w:noProof w:val="0"/>
-          <w:sz w:val="24"/>
-          <w:szCs w:val="24"/>
-          <w:lang w:val="en-US"/>
-        </w:rPr>
-        <w:t xml:space="preserve"> </w:t>
-      </w:r>
-      <w:r>
-        <w:rPr>
-          <w:rFonts w:ascii="Times New Roman" w:hAnsi="Times New Roman" w:eastAsia="Times New Roman" w:cs="Times New Roman"/>
-          <w:noProof w:val="0"/>
-          <w:sz w:val="24"/>
-          <w:szCs w:val="24"/>
-          <w:lang w:val="en-US"/>
-        </w:rPr>
-        <w:t>≥</w:t>
-      </w:r>
-      <w:r>
-        <w:rPr>
-          <w:rFonts w:ascii="Times New Roman" w:hAnsi="Times New Roman" w:eastAsia="Times New Roman" w:cs="Times New Roman"/>
-          <w:noProof w:val="0"/>
-          <w:sz w:val="24"/>
-          <w:szCs w:val="24"/>
-          <w:lang w:val="en-US"/>
-        </w:rPr>
-        <w:t>95%, including 97% of baseline hard drug users and 89% of non-users. Table 2 compares Bayesian models with and without adherence for all four outcomes. Estimates</w:t>
+        <w:t>of ≥</w:t>
+      </w:r>
+      <w:r>
+        <w:rPr>
+          <w:rFonts w:ascii="Times New Roman" w:hAnsi="Times New Roman" w:eastAsia="Times New Roman" w:cs="Times New Roman"/>
+          <w:noProof w:val="0"/>
+          <w:sz w:val="24"/>
+          <w:szCs w:val="24"/>
+          <w:lang w:val="en-US"/>
+        </w:rPr>
+        <w:t>95%, including 97% of baseline hard drug users and 89% of non-users. Table 2 compares Bayesian models with and without adherence for all four outcomes</w:t>
+      </w:r>
+      <w:r>
+        <w:rPr>
+          <w:rFonts w:ascii="Times New Roman" w:hAnsi="Times New Roman" w:eastAsia="Times New Roman" w:cs="Times New Roman"/>
+          <w:noProof w:val="0"/>
+          <w:sz w:val="24"/>
+          <w:szCs w:val="24"/>
+          <w:lang w:val="en-US"/>
+        </w:rPr>
+        <w:t xml:space="preserve"> after adjusting for other baseline covariates (age, BMI, race, education, smoking status, and the baseline outcome value)</w:t>
+      </w:r>
+      <w:r>
+        <w:rPr>
+          <w:rFonts w:ascii="Times New Roman" w:hAnsi="Times New Roman" w:eastAsia="Times New Roman" w:cs="Times New Roman"/>
+          <w:noProof w:val="0"/>
+          <w:sz w:val="24"/>
+          <w:szCs w:val="24"/>
+          <w:lang w:val="en-US"/>
+        </w:rPr>
+        <w:t>. Estimates</w:t>
       </w:r>
       <w:r>
         <w:rPr>
@@ -4974,36 +5416,6 @@
         </w:rPr>
         <w:t xml:space="preserve"> no relationship between baseline drug use and adherence.</w:t>
       </w:r>
-    </w:p>
-    <w:p>
-      <w:pPr>
-        <w:pStyle w:val="Normal"/>
-        <w:spacing w:before="0" w:beforeAutospacing="off" w:after="0" w:afterAutospacing="off" w:line="480" w:lineRule="auto"/>
-        <w:ind w:firstLine="720"/>
-        <w:jc w:val="left"/>
-        <w:rPr>
-          <w:rFonts w:ascii="Times New Roman" w:hAnsi="Times New Roman" w:eastAsia="Times New Roman" w:cs="Times New Roman"/>
-          <w:noProof w:val="0"/>
-          <w:sz w:val="24"/>
-          <w:szCs w:val="24"/>
-          <w:lang w:val="en-US"/>
-        </w:rPr>
-      </w:pPr>
-    </w:p>
-    <w:p>
-      <w:pPr>
-        <w:pStyle w:val="Normal"/>
-        <w:spacing w:before="0" w:beforeAutospacing="off" w:after="0" w:afterAutospacing="off" w:line="480" w:lineRule="auto"/>
-        <w:ind w:firstLine="720"/>
-        <w:jc w:val="left"/>
-        <w:rPr>
-          <w:rFonts w:ascii="Times New Roman" w:hAnsi="Times New Roman" w:eastAsia="Times New Roman" w:cs="Times New Roman"/>
-          <w:noProof w:val="0"/>
-          <w:sz w:val="24"/>
-          <w:szCs w:val="24"/>
-          <w:lang w:val="en-US"/>
-        </w:rPr>
-      </w:pPr>
     </w:p>
     <w:p>
       <w:pPr>
@@ -5267,7 +5679,47 @@
           <w:szCs w:val="24"/>
           <w:lang w:val="en-US"/>
         </w:rPr>
-        <w:t>transformed per the investigator’s request. Both approaches produced similar estimates, 95% CIs/</w:t>
+        <w:t>transformed per the investigator’s request</w:t>
+      </w:r>
+      <w:r>
+        <w:rPr>
+          <w:rFonts w:ascii="Times New Roman" w:hAnsi="Times New Roman" w:eastAsia="Times New Roman" w:cs="Times New Roman"/>
+          <w:noProof w:val="0"/>
+          <w:sz w:val="24"/>
+          <w:szCs w:val="24"/>
+          <w:lang w:val="en-US"/>
+        </w:rPr>
+        <w:t xml:space="preserve"> and to </w:t>
+      </w:r>
+      <w:r>
+        <w:rPr>
+          <w:rFonts w:ascii="Times New Roman" w:hAnsi="Times New Roman" w:eastAsia="Times New Roman" w:cs="Times New Roman"/>
+          <w:noProof w:val="0"/>
+          <w:sz w:val="24"/>
+          <w:szCs w:val="24"/>
+          <w:lang w:val="en-US"/>
+        </w:rPr>
+        <w:t>address</w:t>
+      </w:r>
+      <w:r>
+        <w:rPr>
+          <w:rFonts w:ascii="Times New Roman" w:hAnsi="Times New Roman" w:eastAsia="Times New Roman" w:cs="Times New Roman"/>
+          <w:noProof w:val="0"/>
+          <w:sz w:val="24"/>
+          <w:szCs w:val="24"/>
+          <w:lang w:val="en-US"/>
+        </w:rPr>
+        <w:t xml:space="preserve"> nonnormality</w:t>
+      </w:r>
+      <w:r>
+        <w:rPr>
+          <w:rFonts w:ascii="Times New Roman" w:hAnsi="Times New Roman" w:eastAsia="Times New Roman" w:cs="Times New Roman"/>
+          <w:noProof w:val="0"/>
+          <w:sz w:val="24"/>
+          <w:szCs w:val="24"/>
+          <w:lang w:val="en-US"/>
+        </w:rPr>
+        <w:t>. Both approaches produced similar estimates, 95% CIs/</w:t>
       </w:r>
       <w:r>
         <w:rPr>
@@ -5474,7 +5926,7 @@
     <w:p>
       <w:pPr>
         <w:pStyle w:val="Normal"/>
-        <w:spacing w:before="240" w:beforeAutospacing="off" w:after="0" w:afterAutospacing="off" w:line="240" w:lineRule="auto"/>
+        <w:spacing w:before="240" w:beforeAutospacing="off" w:after="240" w:afterAutospacing="off" w:line="240" w:lineRule="auto"/>
         <w:ind w:firstLine="0"/>
         <w:jc w:val="left"/>
         <w:rPr>
@@ -5655,7 +6107,57 @@
           <w:szCs w:val="24"/>
           <w:lang w:val="en-US"/>
         </w:rPr>
-        <w:t>CrI: −0.41 to 0.39); the CrI includes 0, indicating no statistical significance, and only a 0.8% probability of a decrease of at least 0.5 log</w:t>
+        <w:t>CrI</w:t>
+      </w:r>
+      <w:r>
+        <w:rPr>
+          <w:rFonts w:ascii="Times New Roman" w:hAnsi="Times New Roman" w:eastAsia="Times New Roman" w:cs="Times New Roman"/>
+          <w:noProof w:val="0"/>
+          <w:sz w:val="24"/>
+          <w:szCs w:val="24"/>
+          <w:lang w:val="en-US"/>
+        </w:rPr>
+        <w:t xml:space="preserve">: −0.41 to 0.39); the </w:t>
+      </w:r>
+      <w:r>
+        <w:rPr>
+          <w:rFonts w:ascii="Times New Roman" w:hAnsi="Times New Roman" w:eastAsia="Times New Roman" w:cs="Times New Roman"/>
+          <w:noProof w:val="0"/>
+          <w:sz w:val="24"/>
+          <w:szCs w:val="24"/>
+          <w:lang w:val="en-US"/>
+        </w:rPr>
+        <w:t>CrI</w:t>
+      </w:r>
+      <w:r>
+        <w:rPr>
+          <w:rFonts w:ascii="Times New Roman" w:hAnsi="Times New Roman" w:eastAsia="Times New Roman" w:cs="Times New Roman"/>
+          <w:noProof w:val="0"/>
+          <w:sz w:val="24"/>
+          <w:szCs w:val="24"/>
+          <w:lang w:val="en-US"/>
+        </w:rPr>
+        <w:t xml:space="preserve"> includes 0, </w:t>
+      </w:r>
+      <w:r>
+        <w:rPr>
+          <w:rFonts w:ascii="Times New Roman" w:hAnsi="Times New Roman" w:eastAsia="Times New Roman" w:cs="Times New Roman"/>
+          <w:noProof w:val="0"/>
+          <w:sz w:val="24"/>
+          <w:szCs w:val="24"/>
+          <w:lang w:val="en-US"/>
+        </w:rPr>
+        <w:t>indicating</w:t>
+      </w:r>
+      <w:r>
+        <w:rPr>
+          <w:rFonts w:ascii="Times New Roman" w:hAnsi="Times New Roman" w:eastAsia="Times New Roman" w:cs="Times New Roman"/>
+          <w:noProof w:val="0"/>
+          <w:sz w:val="24"/>
+          <w:szCs w:val="24"/>
+          <w:lang w:val="en-US"/>
+        </w:rPr>
+        <w:t xml:space="preserve"> no statistical significance, and only a 0.8% probability of a decrease of at least 0.5 log</w:t>
       </w:r>
       <w:r>
         <w:rPr>
@@ -5676,7 +6178,247 @@
           <w:szCs w:val="24"/>
           <w:lang w:val="en-US"/>
         </w:rPr>
-        <w:t xml:space="preserve"> suggests no clinically meaningful effect. Mental quality of life decreased by −0.54 points (95% CrI: −4.02 to 2.92); the CrI includes 0, indicating no statistical significance, and only a 20.33% probability of a decrease of at least 2 points indicates limited clinical relevance. Physical quality of life declined by 3.57 points (95% CrI: −6.31 to −0.84), which is statistically significant, with an 87.15% probability of a decrease of at least 2 points, suggesting it is likely clinically meaningful.</w:t>
+        <w:t xml:space="preserve"> </w:t>
+      </w:r>
+      <w:r>
+        <w:rPr>
+          <w:rFonts w:ascii="Times New Roman" w:hAnsi="Times New Roman" w:eastAsia="Times New Roman" w:cs="Times New Roman"/>
+          <w:noProof w:val="0"/>
+          <w:sz w:val="24"/>
+          <w:szCs w:val="24"/>
+          <w:lang w:val="en-US"/>
+        </w:rPr>
+        <w:t xml:space="preserve">which </w:t>
+      </w:r>
+      <w:r>
+        <w:rPr>
+          <w:rFonts w:ascii="Times New Roman" w:hAnsi="Times New Roman" w:eastAsia="Times New Roman" w:cs="Times New Roman"/>
+          <w:noProof w:val="0"/>
+          <w:sz w:val="24"/>
+          <w:szCs w:val="24"/>
+          <w:lang w:val="en-US"/>
+        </w:rPr>
+        <w:t xml:space="preserve">suggests no clinically meaningful effect. Mental </w:t>
+      </w:r>
+      <w:r>
+        <w:rPr>
+          <w:rFonts w:ascii="Times New Roman" w:hAnsi="Times New Roman" w:eastAsia="Times New Roman" w:cs="Times New Roman"/>
+          <w:noProof w:val="0"/>
+          <w:sz w:val="24"/>
+          <w:szCs w:val="24"/>
+          <w:lang w:val="en-US"/>
+        </w:rPr>
+        <w:t>quality</w:t>
+      </w:r>
+      <w:r>
+        <w:rPr>
+          <w:rFonts w:ascii="Times New Roman" w:hAnsi="Times New Roman" w:eastAsia="Times New Roman" w:cs="Times New Roman"/>
+          <w:noProof w:val="0"/>
+          <w:sz w:val="24"/>
+          <w:szCs w:val="24"/>
+          <w:lang w:val="en-US"/>
+        </w:rPr>
+        <w:t>-</w:t>
+      </w:r>
+      <w:r>
+        <w:rPr>
+          <w:rFonts w:ascii="Times New Roman" w:hAnsi="Times New Roman" w:eastAsia="Times New Roman" w:cs="Times New Roman"/>
+          <w:noProof w:val="0"/>
+          <w:sz w:val="24"/>
+          <w:szCs w:val="24"/>
+          <w:lang w:val="en-US"/>
+        </w:rPr>
+        <w:t>of</w:t>
+      </w:r>
+      <w:r>
+        <w:rPr>
+          <w:rFonts w:ascii="Times New Roman" w:hAnsi="Times New Roman" w:eastAsia="Times New Roman" w:cs="Times New Roman"/>
+          <w:noProof w:val="0"/>
+          <w:sz w:val="24"/>
+          <w:szCs w:val="24"/>
+          <w:lang w:val="en-US"/>
+        </w:rPr>
+        <w:t>-</w:t>
+      </w:r>
+      <w:r>
+        <w:rPr>
+          <w:rFonts w:ascii="Times New Roman" w:hAnsi="Times New Roman" w:eastAsia="Times New Roman" w:cs="Times New Roman"/>
+          <w:noProof w:val="0"/>
+          <w:sz w:val="24"/>
+          <w:szCs w:val="24"/>
+          <w:lang w:val="en-US"/>
+        </w:rPr>
+        <w:t xml:space="preserve">life decreased by −0.54 points (95% </w:t>
+      </w:r>
+      <w:r>
+        <w:rPr>
+          <w:rFonts w:ascii="Times New Roman" w:hAnsi="Times New Roman" w:eastAsia="Times New Roman" w:cs="Times New Roman"/>
+          <w:noProof w:val="0"/>
+          <w:sz w:val="24"/>
+          <w:szCs w:val="24"/>
+          <w:lang w:val="en-US"/>
+        </w:rPr>
+        <w:t>CrI</w:t>
+      </w:r>
+      <w:r>
+        <w:rPr>
+          <w:rFonts w:ascii="Times New Roman" w:hAnsi="Times New Roman" w:eastAsia="Times New Roman" w:cs="Times New Roman"/>
+          <w:noProof w:val="0"/>
+          <w:sz w:val="24"/>
+          <w:szCs w:val="24"/>
+          <w:lang w:val="en-US"/>
+        </w:rPr>
+        <w:t xml:space="preserve">: −4.02 to 2.92); the </w:t>
+      </w:r>
+      <w:r>
+        <w:rPr>
+          <w:rFonts w:ascii="Times New Roman" w:hAnsi="Times New Roman" w:eastAsia="Times New Roman" w:cs="Times New Roman"/>
+          <w:noProof w:val="0"/>
+          <w:sz w:val="24"/>
+          <w:szCs w:val="24"/>
+          <w:lang w:val="en-US"/>
+        </w:rPr>
+        <w:t>CrI</w:t>
+      </w:r>
+      <w:r>
+        <w:rPr>
+          <w:rFonts w:ascii="Times New Roman" w:hAnsi="Times New Roman" w:eastAsia="Times New Roman" w:cs="Times New Roman"/>
+          <w:noProof w:val="0"/>
+          <w:sz w:val="24"/>
+          <w:szCs w:val="24"/>
+          <w:lang w:val="en-US"/>
+        </w:rPr>
+        <w:t xml:space="preserve"> includes 0, </w:t>
+      </w:r>
+      <w:r>
+        <w:rPr>
+          <w:rFonts w:ascii="Times New Roman" w:hAnsi="Times New Roman" w:eastAsia="Times New Roman" w:cs="Times New Roman"/>
+          <w:noProof w:val="0"/>
+          <w:sz w:val="24"/>
+          <w:szCs w:val="24"/>
+          <w:lang w:val="en-US"/>
+        </w:rPr>
+        <w:t>indicating</w:t>
+      </w:r>
+      <w:r>
+        <w:rPr>
+          <w:rFonts w:ascii="Times New Roman" w:hAnsi="Times New Roman" w:eastAsia="Times New Roman" w:cs="Times New Roman"/>
+          <w:noProof w:val="0"/>
+          <w:sz w:val="24"/>
+          <w:szCs w:val="24"/>
+          <w:lang w:val="en-US"/>
+        </w:rPr>
+        <w:t xml:space="preserve"> no statistical significance, and only a 20.33% probability of a decrease of at least 2 points </w:t>
+      </w:r>
+      <w:r>
+        <w:rPr>
+          <w:rFonts w:ascii="Times New Roman" w:hAnsi="Times New Roman" w:eastAsia="Times New Roman" w:cs="Times New Roman"/>
+          <w:noProof w:val="0"/>
+          <w:sz w:val="24"/>
+          <w:szCs w:val="24"/>
+          <w:lang w:val="en-US"/>
+        </w:rPr>
+        <w:t>indicates</w:t>
+      </w:r>
+      <w:r>
+        <w:rPr>
+          <w:rFonts w:ascii="Times New Roman" w:hAnsi="Times New Roman" w:eastAsia="Times New Roman" w:cs="Times New Roman"/>
+          <w:noProof w:val="0"/>
+          <w:sz w:val="24"/>
+          <w:szCs w:val="24"/>
+          <w:lang w:val="en-US"/>
+        </w:rPr>
+        <w:t xml:space="preserve"> limited clinical relevance. Physical </w:t>
+      </w:r>
+      <w:r>
+        <w:rPr>
+          <w:rFonts w:ascii="Times New Roman" w:hAnsi="Times New Roman" w:eastAsia="Times New Roman" w:cs="Times New Roman"/>
+          <w:noProof w:val="0"/>
+          <w:sz w:val="24"/>
+          <w:szCs w:val="24"/>
+          <w:lang w:val="en-US"/>
+        </w:rPr>
+        <w:t>quality</w:t>
+      </w:r>
+      <w:r>
+        <w:rPr>
+          <w:rFonts w:ascii="Times New Roman" w:hAnsi="Times New Roman" w:eastAsia="Times New Roman" w:cs="Times New Roman"/>
+          <w:noProof w:val="0"/>
+          <w:sz w:val="24"/>
+          <w:szCs w:val="24"/>
+          <w:lang w:val="en-US"/>
+        </w:rPr>
+        <w:t>-</w:t>
+      </w:r>
+      <w:r>
+        <w:rPr>
+          <w:rFonts w:ascii="Times New Roman" w:hAnsi="Times New Roman" w:eastAsia="Times New Roman" w:cs="Times New Roman"/>
+          <w:noProof w:val="0"/>
+          <w:sz w:val="24"/>
+          <w:szCs w:val="24"/>
+          <w:lang w:val="en-US"/>
+        </w:rPr>
+        <w:t>of</w:t>
+      </w:r>
+      <w:r>
+        <w:rPr>
+          <w:rFonts w:ascii="Times New Roman" w:hAnsi="Times New Roman" w:eastAsia="Times New Roman" w:cs="Times New Roman"/>
+          <w:noProof w:val="0"/>
+          <w:sz w:val="24"/>
+          <w:szCs w:val="24"/>
+          <w:lang w:val="en-US"/>
+        </w:rPr>
+        <w:t>-</w:t>
+      </w:r>
+      <w:r>
+        <w:rPr>
+          <w:rFonts w:ascii="Times New Roman" w:hAnsi="Times New Roman" w:eastAsia="Times New Roman" w:cs="Times New Roman"/>
+          <w:noProof w:val="0"/>
+          <w:sz w:val="24"/>
+          <w:szCs w:val="24"/>
+          <w:lang w:val="en-US"/>
+        </w:rPr>
+        <w:t xml:space="preserve">life declined by 3.57 points (95% </w:t>
+      </w:r>
+      <w:r>
+        <w:rPr>
+          <w:rFonts w:ascii="Times New Roman" w:hAnsi="Times New Roman" w:eastAsia="Times New Roman" w:cs="Times New Roman"/>
+          <w:noProof w:val="0"/>
+          <w:sz w:val="24"/>
+          <w:szCs w:val="24"/>
+          <w:lang w:val="en-US"/>
+        </w:rPr>
+        <w:t>CrI</w:t>
+      </w:r>
+      <w:r>
+        <w:rPr>
+          <w:rFonts w:ascii="Times New Roman" w:hAnsi="Times New Roman" w:eastAsia="Times New Roman" w:cs="Times New Roman"/>
+          <w:noProof w:val="0"/>
+          <w:sz w:val="24"/>
+          <w:szCs w:val="24"/>
+          <w:lang w:val="en-US"/>
+        </w:rPr>
+        <w:t xml:space="preserve">: −6.31 to −0.84), which is statistically significant, with an 87.15% probability of a decrease of at least 2 points, suggesting it is </w:t>
+      </w:r>
+      <w:r>
+        <w:rPr>
+          <w:rFonts w:ascii="Times New Roman" w:hAnsi="Times New Roman" w:eastAsia="Times New Roman" w:cs="Times New Roman"/>
+          <w:noProof w:val="0"/>
+          <w:sz w:val="24"/>
+          <w:szCs w:val="24"/>
+          <w:lang w:val="en-US"/>
+        </w:rPr>
+        <w:t>likely clinically</w:t>
+      </w:r>
+      <w:r>
+        <w:rPr>
+          <w:rFonts w:ascii="Times New Roman" w:hAnsi="Times New Roman" w:eastAsia="Times New Roman" w:cs="Times New Roman"/>
+          <w:noProof w:val="0"/>
+          <w:sz w:val="24"/>
+          <w:szCs w:val="24"/>
+          <w:lang w:val="en-US"/>
+        </w:rPr>
+        <w:t xml:space="preserve"> meaningful.</w:t>
       </w:r>
     </w:p>
     <w:p>
@@ -5701,17 +6443,207 @@
           <w:szCs w:val="24"/>
           <w:lang w:val="en-US"/>
         </w:rPr>
-        <w:t xml:space="preserve">Figures 1 and 2 show the posterior means for clinical and quality-of-life outcomes by baseline hard drug use status, with observed values overlaid. CD4+ T cell counts and physical quality of life scores are lower among hard drug users, with posterior means noticeably below those of non-users. Viral load and mental quality of life scores show similar posterior means between groups, reflecting minimal differences. </w:t>
-      </w:r>
-      <w:r>
-        <w:rPr>
-          <w:rFonts w:ascii="Times New Roman" w:hAnsi="Times New Roman" w:eastAsia="Times New Roman" w:cs="Times New Roman"/>
-          <w:noProof w:val="0"/>
-          <w:sz w:val="24"/>
-          <w:szCs w:val="24"/>
-          <w:lang w:val="en-US"/>
-        </w:rPr>
-        <w:t>The scatter of observed values highlights individual variability within each group and the wider 95% CrIs for drug users due to smaller sample size. Overall, the figures are consistent with the model findings, showing that baseline hard drug use is associated with declines in immune function and physical well-being, but not in viral load or mental quality of life over two years.</w:t>
+        <w:t xml:space="preserve">Figures 1 and 2 show the posterior means for clinical and </w:t>
+      </w:r>
+      <w:r>
+        <w:rPr>
+          <w:rFonts w:ascii="Times New Roman" w:hAnsi="Times New Roman" w:eastAsia="Times New Roman" w:cs="Times New Roman"/>
+          <w:noProof w:val="0"/>
+          <w:sz w:val="24"/>
+          <w:szCs w:val="24"/>
+          <w:lang w:val="en-US"/>
+        </w:rPr>
+        <w:t>quality</w:t>
+      </w:r>
+      <w:r>
+        <w:rPr>
+          <w:rFonts w:ascii="Times New Roman" w:hAnsi="Times New Roman" w:eastAsia="Times New Roman" w:cs="Times New Roman"/>
+          <w:noProof w:val="0"/>
+          <w:sz w:val="24"/>
+          <w:szCs w:val="24"/>
+          <w:lang w:val="en-US"/>
+        </w:rPr>
+        <w:t xml:space="preserve">-of-life outcomes by baseline hard drug use status, with observed values overlaid. CD4+ T cell counts and physical </w:t>
+      </w:r>
+      <w:r>
+        <w:rPr>
+          <w:rFonts w:ascii="Times New Roman" w:hAnsi="Times New Roman" w:eastAsia="Times New Roman" w:cs="Times New Roman"/>
+          <w:noProof w:val="0"/>
+          <w:sz w:val="24"/>
+          <w:szCs w:val="24"/>
+          <w:lang w:val="en-US"/>
+        </w:rPr>
+        <w:t>quality</w:t>
+      </w:r>
+      <w:r>
+        <w:rPr>
+          <w:rFonts w:ascii="Times New Roman" w:hAnsi="Times New Roman" w:eastAsia="Times New Roman" w:cs="Times New Roman"/>
+          <w:noProof w:val="0"/>
+          <w:sz w:val="24"/>
+          <w:szCs w:val="24"/>
+          <w:lang w:val="en-US"/>
+        </w:rPr>
+        <w:t>-</w:t>
+      </w:r>
+      <w:r>
+        <w:rPr>
+          <w:rFonts w:ascii="Times New Roman" w:hAnsi="Times New Roman" w:eastAsia="Times New Roman" w:cs="Times New Roman"/>
+          <w:noProof w:val="0"/>
+          <w:sz w:val="24"/>
+          <w:szCs w:val="24"/>
+          <w:lang w:val="en-US"/>
+        </w:rPr>
+        <w:t>of</w:t>
+      </w:r>
+      <w:r>
+        <w:rPr>
+          <w:rFonts w:ascii="Times New Roman" w:hAnsi="Times New Roman" w:eastAsia="Times New Roman" w:cs="Times New Roman"/>
+          <w:noProof w:val="0"/>
+          <w:sz w:val="24"/>
+          <w:szCs w:val="24"/>
+          <w:lang w:val="en-US"/>
+        </w:rPr>
+        <w:t>-l</w:t>
+      </w:r>
+      <w:r>
+        <w:rPr>
+          <w:rFonts w:ascii="Times New Roman" w:hAnsi="Times New Roman" w:eastAsia="Times New Roman" w:cs="Times New Roman"/>
+          <w:noProof w:val="0"/>
+          <w:sz w:val="24"/>
+          <w:szCs w:val="24"/>
+          <w:lang w:val="en-US"/>
+        </w:rPr>
+        <w:t xml:space="preserve">ife scores are lower among hard drug users, with posterior means noticeably below those of non-users. Viral load and mental </w:t>
+      </w:r>
+      <w:r>
+        <w:rPr>
+          <w:rFonts w:ascii="Times New Roman" w:hAnsi="Times New Roman" w:eastAsia="Times New Roman" w:cs="Times New Roman"/>
+          <w:noProof w:val="0"/>
+          <w:sz w:val="24"/>
+          <w:szCs w:val="24"/>
+          <w:lang w:val="en-US"/>
+        </w:rPr>
+        <w:t>quality</w:t>
+      </w:r>
+      <w:r>
+        <w:rPr>
+          <w:rFonts w:ascii="Times New Roman" w:hAnsi="Times New Roman" w:eastAsia="Times New Roman" w:cs="Times New Roman"/>
+          <w:noProof w:val="0"/>
+          <w:sz w:val="24"/>
+          <w:szCs w:val="24"/>
+          <w:lang w:val="en-US"/>
+        </w:rPr>
+        <w:t>-</w:t>
+      </w:r>
+      <w:r>
+        <w:rPr>
+          <w:rFonts w:ascii="Times New Roman" w:hAnsi="Times New Roman" w:eastAsia="Times New Roman" w:cs="Times New Roman"/>
+          <w:noProof w:val="0"/>
+          <w:sz w:val="24"/>
+          <w:szCs w:val="24"/>
+          <w:lang w:val="en-US"/>
+        </w:rPr>
+        <w:t>of</w:t>
+      </w:r>
+      <w:r>
+        <w:rPr>
+          <w:rFonts w:ascii="Times New Roman" w:hAnsi="Times New Roman" w:eastAsia="Times New Roman" w:cs="Times New Roman"/>
+          <w:noProof w:val="0"/>
+          <w:sz w:val="24"/>
+          <w:szCs w:val="24"/>
+          <w:lang w:val="en-US"/>
+        </w:rPr>
+        <w:t>-</w:t>
+      </w:r>
+      <w:r>
+        <w:rPr>
+          <w:rFonts w:ascii="Times New Roman" w:hAnsi="Times New Roman" w:eastAsia="Times New Roman" w:cs="Times New Roman"/>
+          <w:noProof w:val="0"/>
+          <w:sz w:val="24"/>
+          <w:szCs w:val="24"/>
+          <w:lang w:val="en-US"/>
+        </w:rPr>
+        <w:t xml:space="preserve">life scores show similar posterior means between groups, reflecting minimal differences. </w:t>
+      </w:r>
+      <w:r>
+        <w:rPr>
+          <w:rFonts w:ascii="Times New Roman" w:hAnsi="Times New Roman" w:eastAsia="Times New Roman" w:cs="Times New Roman"/>
+          <w:noProof w:val="0"/>
+          <w:sz w:val="24"/>
+          <w:szCs w:val="24"/>
+          <w:lang w:val="en-US"/>
+        </w:rPr>
+        <w:t xml:space="preserve">The scatter of observed values highlights individual variability within each group and the wider 95% </w:t>
+      </w:r>
+      <w:r>
+        <w:rPr>
+          <w:rFonts w:ascii="Times New Roman" w:hAnsi="Times New Roman" w:eastAsia="Times New Roman" w:cs="Times New Roman"/>
+          <w:noProof w:val="0"/>
+          <w:sz w:val="24"/>
+          <w:szCs w:val="24"/>
+          <w:lang w:val="en-US"/>
+        </w:rPr>
+        <w:t>CrIs</w:t>
+      </w:r>
+      <w:r>
+        <w:rPr>
+          <w:rFonts w:ascii="Times New Roman" w:hAnsi="Times New Roman" w:eastAsia="Times New Roman" w:cs="Times New Roman"/>
+          <w:noProof w:val="0"/>
+          <w:sz w:val="24"/>
+          <w:szCs w:val="24"/>
+          <w:lang w:val="en-US"/>
+        </w:rPr>
+        <w:t xml:space="preserve"> for drug users due to smaller sample size. Overall, the figures are consistent with the model findings, showing that baseline hard drug use is associated with declines in immune function and physical well-being, but not in viral load or mental </w:t>
+      </w:r>
+      <w:r>
+        <w:rPr>
+          <w:rFonts w:ascii="Times New Roman" w:hAnsi="Times New Roman" w:eastAsia="Times New Roman" w:cs="Times New Roman"/>
+          <w:noProof w:val="0"/>
+          <w:sz w:val="24"/>
+          <w:szCs w:val="24"/>
+          <w:lang w:val="en-US"/>
+        </w:rPr>
+        <w:t>quality</w:t>
+      </w:r>
+      <w:r>
+        <w:rPr>
+          <w:rFonts w:ascii="Times New Roman" w:hAnsi="Times New Roman" w:eastAsia="Times New Roman" w:cs="Times New Roman"/>
+          <w:noProof w:val="0"/>
+          <w:sz w:val="24"/>
+          <w:szCs w:val="24"/>
+          <w:lang w:val="en-US"/>
+        </w:rPr>
+        <w:t>-</w:t>
+      </w:r>
+      <w:r>
+        <w:rPr>
+          <w:rFonts w:ascii="Times New Roman" w:hAnsi="Times New Roman" w:eastAsia="Times New Roman" w:cs="Times New Roman"/>
+          <w:noProof w:val="0"/>
+          <w:sz w:val="24"/>
+          <w:szCs w:val="24"/>
+          <w:lang w:val="en-US"/>
+        </w:rPr>
+        <w:t>of</w:t>
+      </w:r>
+      <w:r>
+        <w:rPr>
+          <w:rFonts w:ascii="Times New Roman" w:hAnsi="Times New Roman" w:eastAsia="Times New Roman" w:cs="Times New Roman"/>
+          <w:noProof w:val="0"/>
+          <w:sz w:val="24"/>
+          <w:szCs w:val="24"/>
+          <w:lang w:val="en-US"/>
+        </w:rPr>
+        <w:t>-</w:t>
+      </w:r>
+      <w:r>
+        <w:rPr>
+          <w:rFonts w:ascii="Times New Roman" w:hAnsi="Times New Roman" w:eastAsia="Times New Roman" w:cs="Times New Roman"/>
+          <w:noProof w:val="0"/>
+          <w:sz w:val="24"/>
+          <w:szCs w:val="24"/>
+          <w:lang w:val="en-US"/>
+        </w:rPr>
+        <w:t>life over two years.</w:t>
       </w:r>
     </w:p>
     <w:p>
@@ -5862,7 +6794,7 @@
     <w:p>
       <w:pPr>
         <w:pStyle w:val="Normal"/>
-        <w:spacing w:before="0" w:beforeAutospacing="off" w:after="0" w:afterAutospacing="off" w:line="240" w:lineRule="auto"/>
+        <w:spacing w:before="0" w:beforeAutospacing="off" w:after="240" w:afterAutospacing="off" w:line="240" w:lineRule="auto"/>
         <w:ind w:firstLine="0"/>
         <w:jc w:val="left"/>
         <w:rPr>
@@ -5875,7 +6807,7 @@
       </w:pPr>
       <w:r>
         <w:drawing>
-          <wp:inline wp14:editId="57BEEA35" wp14:anchorId="1BA39CEE">
+          <wp:inline wp14:editId="1A6714AA" wp14:anchorId="1BA39CEE">
             <wp:extent cx="6095276" cy="3291840"/>
             <wp:effectExtent l="0" t="0" r="0" b="0"/>
             <wp:docPr id="188934933" name="drawing"/>
@@ -5956,7 +6888,157 @@
           <w:szCs w:val="24"/>
           <w:lang w:val="en-US"/>
         </w:rPr>
-        <w:t xml:space="preserve"> quality of life scores (gray points) by baseline hard drug use group, with posterior means (pink dots) and 95% credible intervals (blue bars) overlaid. Physical quality of life shows a noticeable decline among hard drug users, while mental quality of life differences </w:t>
+        <w:t xml:space="preserve"> </w:t>
+      </w:r>
+      <w:r>
+        <w:rPr>
+          <w:rFonts w:ascii="Times New Roman" w:hAnsi="Times New Roman" w:eastAsia="Times New Roman" w:cs="Times New Roman"/>
+          <w:noProof w:val="0"/>
+          <w:sz w:val="24"/>
+          <w:szCs w:val="24"/>
+          <w:lang w:val="en-US"/>
+        </w:rPr>
+        <w:t>quality</w:t>
+      </w:r>
+      <w:r>
+        <w:rPr>
+          <w:rFonts w:ascii="Times New Roman" w:hAnsi="Times New Roman" w:eastAsia="Times New Roman" w:cs="Times New Roman"/>
+          <w:noProof w:val="0"/>
+          <w:sz w:val="24"/>
+          <w:szCs w:val="24"/>
+          <w:lang w:val="en-US"/>
+        </w:rPr>
+        <w:t>-</w:t>
+      </w:r>
+      <w:r>
+        <w:rPr>
+          <w:rFonts w:ascii="Times New Roman" w:hAnsi="Times New Roman" w:eastAsia="Times New Roman" w:cs="Times New Roman"/>
+          <w:noProof w:val="0"/>
+          <w:sz w:val="24"/>
+          <w:szCs w:val="24"/>
+          <w:lang w:val="en-US"/>
+        </w:rPr>
+        <w:t>of</w:t>
+      </w:r>
+      <w:r>
+        <w:rPr>
+          <w:rFonts w:ascii="Times New Roman" w:hAnsi="Times New Roman" w:eastAsia="Times New Roman" w:cs="Times New Roman"/>
+          <w:noProof w:val="0"/>
+          <w:sz w:val="24"/>
+          <w:szCs w:val="24"/>
+          <w:lang w:val="en-US"/>
+        </w:rPr>
+        <w:t>-</w:t>
+      </w:r>
+      <w:r>
+        <w:rPr>
+          <w:rFonts w:ascii="Times New Roman" w:hAnsi="Times New Roman" w:eastAsia="Times New Roman" w:cs="Times New Roman"/>
+          <w:noProof w:val="0"/>
+          <w:sz w:val="24"/>
+          <w:szCs w:val="24"/>
+          <w:lang w:val="en-US"/>
+        </w:rPr>
+        <w:t xml:space="preserve">life scores (gray points) by baseline hard drug use group, with posterior means (pink dots) and 95% credible intervals (blue bars) overlaid. Physical </w:t>
+      </w:r>
+      <w:r>
+        <w:rPr>
+          <w:rFonts w:ascii="Times New Roman" w:hAnsi="Times New Roman" w:eastAsia="Times New Roman" w:cs="Times New Roman"/>
+          <w:noProof w:val="0"/>
+          <w:sz w:val="24"/>
+          <w:szCs w:val="24"/>
+          <w:lang w:val="en-US"/>
+        </w:rPr>
+        <w:t>quality</w:t>
+      </w:r>
+      <w:r>
+        <w:rPr>
+          <w:rFonts w:ascii="Times New Roman" w:hAnsi="Times New Roman" w:eastAsia="Times New Roman" w:cs="Times New Roman"/>
+          <w:noProof w:val="0"/>
+          <w:sz w:val="24"/>
+          <w:szCs w:val="24"/>
+          <w:lang w:val="en-US"/>
+        </w:rPr>
+        <w:t>-</w:t>
+      </w:r>
+      <w:r>
+        <w:rPr>
+          <w:rFonts w:ascii="Times New Roman" w:hAnsi="Times New Roman" w:eastAsia="Times New Roman" w:cs="Times New Roman"/>
+          <w:noProof w:val="0"/>
+          <w:sz w:val="24"/>
+          <w:szCs w:val="24"/>
+          <w:lang w:val="en-US"/>
+        </w:rPr>
+        <w:t>of</w:t>
+      </w:r>
+      <w:r>
+        <w:rPr>
+          <w:rFonts w:ascii="Times New Roman" w:hAnsi="Times New Roman" w:eastAsia="Times New Roman" w:cs="Times New Roman"/>
+          <w:noProof w:val="0"/>
+          <w:sz w:val="24"/>
+          <w:szCs w:val="24"/>
+          <w:lang w:val="en-US"/>
+        </w:rPr>
+        <w:t>-</w:t>
+      </w:r>
+      <w:r>
+        <w:rPr>
+          <w:rFonts w:ascii="Times New Roman" w:hAnsi="Times New Roman" w:eastAsia="Times New Roman" w:cs="Times New Roman"/>
+          <w:noProof w:val="0"/>
+          <w:sz w:val="24"/>
+          <w:szCs w:val="24"/>
+          <w:lang w:val="en-US"/>
+        </w:rPr>
+        <w:t xml:space="preserve">life shows a noticeable decline among hard drug users, while mental </w:t>
+      </w:r>
+      <w:r>
+        <w:rPr>
+          <w:rFonts w:ascii="Times New Roman" w:hAnsi="Times New Roman" w:eastAsia="Times New Roman" w:cs="Times New Roman"/>
+          <w:noProof w:val="0"/>
+          <w:sz w:val="24"/>
+          <w:szCs w:val="24"/>
+          <w:lang w:val="en-US"/>
+        </w:rPr>
+        <w:t>quality</w:t>
+      </w:r>
+      <w:r>
+        <w:rPr>
+          <w:rFonts w:ascii="Times New Roman" w:hAnsi="Times New Roman" w:eastAsia="Times New Roman" w:cs="Times New Roman"/>
+          <w:noProof w:val="0"/>
+          <w:sz w:val="24"/>
+          <w:szCs w:val="24"/>
+          <w:lang w:val="en-US"/>
+        </w:rPr>
+        <w:t>-</w:t>
+      </w:r>
+      <w:r>
+        <w:rPr>
+          <w:rFonts w:ascii="Times New Roman" w:hAnsi="Times New Roman" w:eastAsia="Times New Roman" w:cs="Times New Roman"/>
+          <w:noProof w:val="0"/>
+          <w:sz w:val="24"/>
+          <w:szCs w:val="24"/>
+          <w:lang w:val="en-US"/>
+        </w:rPr>
+        <w:t>of</w:t>
+      </w:r>
+      <w:r>
+        <w:rPr>
+          <w:rFonts w:ascii="Times New Roman" w:hAnsi="Times New Roman" w:eastAsia="Times New Roman" w:cs="Times New Roman"/>
+          <w:noProof w:val="0"/>
+          <w:sz w:val="24"/>
+          <w:szCs w:val="24"/>
+          <w:lang w:val="en-US"/>
+        </w:rPr>
+        <w:t>-</w:t>
+      </w:r>
+      <w:r>
+        <w:rPr>
+          <w:rFonts w:ascii="Times New Roman" w:hAnsi="Times New Roman" w:eastAsia="Times New Roman" w:cs="Times New Roman"/>
+          <w:noProof w:val="0"/>
+          <w:sz w:val="24"/>
+          <w:szCs w:val="24"/>
+          <w:lang w:val="en-US"/>
+        </w:rPr>
+        <w:t xml:space="preserve">life differences </w:t>
       </w:r>
       <w:r>
         <w:rPr>
@@ -6109,7 +7191,107 @@
           <w:szCs w:val="24"/>
           <w:lang w:val="en-US"/>
         </w:rPr>
-        <w:t>Baseline hard drug use was associated with declines in CD4+ T cell counts and physical quality of life, both statistically significant and clinically meaningful. In contrast, viral load and mental quality of life showed no significant changes and low probabilities of clinically meaningful effects.</w:t>
+        <w:t xml:space="preserve">Baseline hard drug use was associated with declines in CD4+ T cell counts and physical </w:t>
+      </w:r>
+      <w:r>
+        <w:rPr>
+          <w:rFonts w:ascii="Times New Roman" w:hAnsi="Times New Roman" w:eastAsia="Times New Roman" w:cs="Times New Roman"/>
+          <w:noProof w:val="0"/>
+          <w:sz w:val="24"/>
+          <w:szCs w:val="24"/>
+          <w:lang w:val="en-US"/>
+        </w:rPr>
+        <w:t>quality</w:t>
+      </w:r>
+      <w:r>
+        <w:rPr>
+          <w:rFonts w:ascii="Times New Roman" w:hAnsi="Times New Roman" w:eastAsia="Times New Roman" w:cs="Times New Roman"/>
+          <w:noProof w:val="0"/>
+          <w:sz w:val="24"/>
+          <w:szCs w:val="24"/>
+          <w:lang w:val="en-US"/>
+        </w:rPr>
+        <w:t>-</w:t>
+      </w:r>
+      <w:r>
+        <w:rPr>
+          <w:rFonts w:ascii="Times New Roman" w:hAnsi="Times New Roman" w:eastAsia="Times New Roman" w:cs="Times New Roman"/>
+          <w:noProof w:val="0"/>
+          <w:sz w:val="24"/>
+          <w:szCs w:val="24"/>
+          <w:lang w:val="en-US"/>
+        </w:rPr>
+        <w:t>of</w:t>
+      </w:r>
+      <w:r>
+        <w:rPr>
+          <w:rFonts w:ascii="Times New Roman" w:hAnsi="Times New Roman" w:eastAsia="Times New Roman" w:cs="Times New Roman"/>
+          <w:noProof w:val="0"/>
+          <w:sz w:val="24"/>
+          <w:szCs w:val="24"/>
+          <w:lang w:val="en-US"/>
+        </w:rPr>
+        <w:t>-</w:t>
+      </w:r>
+      <w:r>
+        <w:rPr>
+          <w:rFonts w:ascii="Times New Roman" w:hAnsi="Times New Roman" w:eastAsia="Times New Roman" w:cs="Times New Roman"/>
+          <w:noProof w:val="0"/>
+          <w:sz w:val="24"/>
+          <w:szCs w:val="24"/>
+          <w:lang w:val="en-US"/>
+        </w:rPr>
+        <w:t xml:space="preserve">life, both statistically significant and clinically meaningful. In contrast, viral load and mental </w:t>
+      </w:r>
+      <w:r>
+        <w:rPr>
+          <w:rFonts w:ascii="Times New Roman" w:hAnsi="Times New Roman" w:eastAsia="Times New Roman" w:cs="Times New Roman"/>
+          <w:noProof w:val="0"/>
+          <w:sz w:val="24"/>
+          <w:szCs w:val="24"/>
+          <w:lang w:val="en-US"/>
+        </w:rPr>
+        <w:t>quality</w:t>
+      </w:r>
+      <w:r>
+        <w:rPr>
+          <w:rFonts w:ascii="Times New Roman" w:hAnsi="Times New Roman" w:eastAsia="Times New Roman" w:cs="Times New Roman"/>
+          <w:noProof w:val="0"/>
+          <w:sz w:val="24"/>
+          <w:szCs w:val="24"/>
+          <w:lang w:val="en-US"/>
+        </w:rPr>
+        <w:t>-</w:t>
+      </w:r>
+      <w:r>
+        <w:rPr>
+          <w:rFonts w:ascii="Times New Roman" w:hAnsi="Times New Roman" w:eastAsia="Times New Roman" w:cs="Times New Roman"/>
+          <w:noProof w:val="0"/>
+          <w:sz w:val="24"/>
+          <w:szCs w:val="24"/>
+          <w:lang w:val="en-US"/>
+        </w:rPr>
+        <w:t>of</w:t>
+      </w:r>
+      <w:r>
+        <w:rPr>
+          <w:rFonts w:ascii="Times New Roman" w:hAnsi="Times New Roman" w:eastAsia="Times New Roman" w:cs="Times New Roman"/>
+          <w:noProof w:val="0"/>
+          <w:sz w:val="24"/>
+          <w:szCs w:val="24"/>
+          <w:lang w:val="en-US"/>
+        </w:rPr>
+        <w:t>-</w:t>
+      </w:r>
+      <w:r>
+        <w:rPr>
+          <w:rFonts w:ascii="Times New Roman" w:hAnsi="Times New Roman" w:eastAsia="Times New Roman" w:cs="Times New Roman"/>
+          <w:noProof w:val="0"/>
+          <w:sz w:val="24"/>
+          <w:szCs w:val="24"/>
+          <w:lang w:val="en-US"/>
+        </w:rPr>
+        <w:t>life showed no significant changes and low probabilities of clinically meaningful effects.</w:t>
       </w:r>
     </w:p>
     <w:p>
@@ -6215,6 +7397,13 @@
         <w:spacing w:before="0" w:beforeAutospacing="off" w:after="0" w:afterAutospacing="off" w:line="480" w:lineRule="auto"/>
         <w:ind w:firstLine="720"/>
         <w:jc w:val="left"/>
+        <w:rPr>
+          <w:rFonts w:ascii="Times New Roman" w:hAnsi="Times New Roman" w:eastAsia="Times New Roman" w:cs="Times New Roman"/>
+          <w:noProof w:val="0"/>
+          <w:sz w:val="24"/>
+          <w:szCs w:val="24"/>
+          <w:lang w:val="en-US"/>
+        </w:rPr>
       </w:pPr>
       <w:r>
         <w:rPr>
@@ -6264,7 +7453,47 @@
           <w:szCs w:val="24"/>
           <w:lang w:val="en-US"/>
         </w:rPr>
-        <w:t xml:space="preserve"> may also have been lost when certain variables had to be simplified into broader categories due to small group sizes. Since drug use was self‑reported, inaccurate reporting could introduce misclassification bias, which may influence true differences between individuals who used hard drugs and those who did not. Other factors not captured in the dataset, including continued drug use after baseline, mental health challenges, or other health conditions, may have influenced the outcomes. Finally, some outcomes showed a wide range of responses, reflecting the natural variability that exists across individuals and potential outliers.</w:t>
+        <w:t xml:space="preserve"> may also have been lost when certain variables had to be simplified into broader categories due to small group sizes. Since drug use was self‑reported, inaccurate reporting could introduce misclassification bias, which may influence true differences between individuals who used hard drugs and those who did not. </w:t>
+      </w:r>
+      <w:r>
+        <w:rPr>
+          <w:rFonts w:ascii="Times New Roman" w:hAnsi="Times New Roman" w:eastAsia="Times New Roman" w:cs="Times New Roman"/>
+          <w:noProof w:val="0"/>
+          <w:sz w:val="24"/>
+          <w:szCs w:val="24"/>
+          <w:lang w:val="en-US"/>
+        </w:rPr>
+        <w:t>Finally, o</w:t>
+      </w:r>
+      <w:r>
+        <w:rPr>
+          <w:rFonts w:ascii="Times New Roman" w:hAnsi="Times New Roman" w:eastAsia="Times New Roman" w:cs="Times New Roman"/>
+          <w:noProof w:val="0"/>
+          <w:sz w:val="24"/>
+          <w:szCs w:val="24"/>
+          <w:lang w:val="en-US"/>
+        </w:rPr>
+        <w:t xml:space="preserve">ther factors not captured in the </w:t>
+      </w:r>
+      <w:r>
+        <w:rPr>
+          <w:rFonts w:ascii="Times New Roman" w:hAnsi="Times New Roman" w:eastAsia="Times New Roman" w:cs="Times New Roman"/>
+          <w:noProof w:val="0"/>
+          <w:sz w:val="24"/>
+          <w:szCs w:val="24"/>
+          <w:lang w:val="en-US"/>
+        </w:rPr>
+        <w:t>models</w:t>
+      </w:r>
+      <w:r>
+        <w:rPr>
+          <w:rFonts w:ascii="Times New Roman" w:hAnsi="Times New Roman" w:eastAsia="Times New Roman" w:cs="Times New Roman"/>
+          <w:noProof w:val="0"/>
+          <w:sz w:val="24"/>
+          <w:szCs w:val="24"/>
+          <w:lang w:val="en-US"/>
+        </w:rPr>
+        <w:t>, including continued drug use after baseline, mental health challenges, or other health conditions, may have influenced the outcomes.</w:t>
       </w:r>
     </w:p>
     <w:p>
@@ -6289,7 +7518,87 @@
           <w:szCs w:val="24"/>
           <w:lang w:val="en-US"/>
         </w:rPr>
-        <w:t>In conclusion, baseline hard drug use was associated with significant declines in CD4+ T cell counts and physical quality of life over two years following HAART, while viral load and mental quality of life were unaffected. These associations were not explained by adherence, highlighting the importance of considering substance use history in evaluating early immunologic and functional responses to HAART.</w:t>
+        <w:t>In conclusion, baseline hard drug use was associated with significant declines in CD4+ T cell counts and physical quality</w:t>
+      </w:r>
+      <w:r>
+        <w:rPr>
+          <w:rFonts w:ascii="Times New Roman" w:hAnsi="Times New Roman" w:eastAsia="Times New Roman" w:cs="Times New Roman"/>
+          <w:noProof w:val="0"/>
+          <w:sz w:val="24"/>
+          <w:szCs w:val="24"/>
+          <w:lang w:val="en-US"/>
+        </w:rPr>
+        <w:t>-</w:t>
+      </w:r>
+      <w:r>
+        <w:rPr>
+          <w:rFonts w:ascii="Times New Roman" w:hAnsi="Times New Roman" w:eastAsia="Times New Roman" w:cs="Times New Roman"/>
+          <w:noProof w:val="0"/>
+          <w:sz w:val="24"/>
+          <w:szCs w:val="24"/>
+          <w:lang w:val="en-US"/>
+        </w:rPr>
+        <w:t>of</w:t>
+      </w:r>
+      <w:r>
+        <w:rPr>
+          <w:rFonts w:ascii="Times New Roman" w:hAnsi="Times New Roman" w:eastAsia="Times New Roman" w:cs="Times New Roman"/>
+          <w:noProof w:val="0"/>
+          <w:sz w:val="24"/>
+          <w:szCs w:val="24"/>
+          <w:lang w:val="en-US"/>
+        </w:rPr>
+        <w:t>-</w:t>
+      </w:r>
+      <w:r>
+        <w:rPr>
+          <w:rFonts w:ascii="Times New Roman" w:hAnsi="Times New Roman" w:eastAsia="Times New Roman" w:cs="Times New Roman"/>
+          <w:noProof w:val="0"/>
+          <w:sz w:val="24"/>
+          <w:szCs w:val="24"/>
+          <w:lang w:val="en-US"/>
+        </w:rPr>
+        <w:t>life over two years following HAART, while viral load and mental quality</w:t>
+      </w:r>
+      <w:r>
+        <w:rPr>
+          <w:rFonts w:ascii="Times New Roman" w:hAnsi="Times New Roman" w:eastAsia="Times New Roman" w:cs="Times New Roman"/>
+          <w:noProof w:val="0"/>
+          <w:sz w:val="24"/>
+          <w:szCs w:val="24"/>
+          <w:lang w:val="en-US"/>
+        </w:rPr>
+        <w:t>-</w:t>
+      </w:r>
+      <w:r>
+        <w:rPr>
+          <w:rFonts w:ascii="Times New Roman" w:hAnsi="Times New Roman" w:eastAsia="Times New Roman" w:cs="Times New Roman"/>
+          <w:noProof w:val="0"/>
+          <w:sz w:val="24"/>
+          <w:szCs w:val="24"/>
+          <w:lang w:val="en-US"/>
+        </w:rPr>
+        <w:t>of</w:t>
+      </w:r>
+      <w:r>
+        <w:rPr>
+          <w:rFonts w:ascii="Times New Roman" w:hAnsi="Times New Roman" w:eastAsia="Times New Roman" w:cs="Times New Roman"/>
+          <w:noProof w:val="0"/>
+          <w:sz w:val="24"/>
+          <w:szCs w:val="24"/>
+          <w:lang w:val="en-US"/>
+        </w:rPr>
+        <w:t>-</w:t>
+      </w:r>
+      <w:r>
+        <w:rPr>
+          <w:rFonts w:ascii="Times New Roman" w:hAnsi="Times New Roman" w:eastAsia="Times New Roman" w:cs="Times New Roman"/>
+          <w:noProof w:val="0"/>
+          <w:sz w:val="24"/>
+          <w:szCs w:val="24"/>
+          <w:lang w:val="en-US"/>
+        </w:rPr>
+        <w:t>life were unaffected. These associations were not explained by adherence, highlighting the importance of considering substance use history in evaluating early immunologic and functional responses to HAART.</w:t>
       </w:r>
     </w:p>
     <w:p xmlns:wp14="http://schemas.microsoft.com/office/word/2010/wordml" wp14:paraId="2C078E63" wp14:textId="318845C2">

</xml_diff>